<commit_message>
aggiornamento mese di laurea
</commit_message>
<xml_diff>
--- a/documents/relazioneTecnica.docx
+++ b/documents/relazioneTecnica.docx
@@ -926,7 +926,7 @@
           <w:sz w:val="24"/>
           <w:szCs w:val="24"/>
         </w:rPr>
-        <w:t>Marzo</w:t>
+        <w:t>Luglio</w:t>
       </w:r>
       <w:r>
         <w:rPr>
@@ -7428,16 +7428,14 @@
         </w:rPr>
         <w:t xml:space="preserve">L'articolo 32 del GDPR richiede che le aziende implementino misure tecniche e organizzative adeguate </w:t>
       </w:r>
-      <w:proofErr w:type="gramStart"/>
-      <w:r>
-        <w:rPr>
-          <w:rFonts w:asciiTheme="majorHAnsi" w:hAnsiTheme="majorHAnsi" w:cstheme="majorHAnsi"/>
-          <w:sz w:val="24"/>
-          <w:szCs w:val="24"/>
-        </w:rPr>
-        <w:t>per</w:t>
-      </w:r>
-      <w:proofErr w:type="gramEnd"/>
+      <w:r>
+        <w:rPr>
+          <w:rFonts w:asciiTheme="majorHAnsi" w:hAnsiTheme="majorHAnsi" w:cstheme="majorHAnsi"/>
+          <w:sz w:val="24"/>
+          <w:szCs w:val="24"/>
+        </w:rPr>
+        <w:t>a</w:t>
+      </w:r>
       <w:r>
         <w:rPr>
           <w:rFonts w:asciiTheme="majorHAnsi" w:hAnsiTheme="majorHAnsi" w:cstheme="majorHAnsi"/>
@@ -15223,7 +15221,7 @@
           <w:szCs w:val="24"/>
         </w:rPr>
         <w:drawing>
-          <wp:inline distT="0" distB="0" distL="0" distR="0" wp14:anchorId="47327704" wp14:editId="752179CB">
+          <wp:inline distT="0" distB="0" distL="0" distR="0" wp14:anchorId="47327704" wp14:editId="25FC70CD">
             <wp:extent cx="5749925" cy="2528570"/>
             <wp:effectExtent l="0" t="0" r="3175" b="5080"/>
             <wp:docPr id="1768673364" name="Immagine 10"/>
@@ -17183,7 +17181,7 @@
           <w:szCs w:val="24"/>
         </w:rPr>
         <w:drawing>
-          <wp:inline distT="0" distB="0" distL="0" distR="0" wp14:anchorId="55330AC2" wp14:editId="527888B5">
+          <wp:inline distT="0" distB="0" distL="0" distR="0" wp14:anchorId="55330AC2" wp14:editId="77DAF52B">
             <wp:extent cx="5749925" cy="2985770"/>
             <wp:effectExtent l="0" t="0" r="3175" b="5080"/>
             <wp:docPr id="1690615145" name="Immagine 21"/>
@@ -17976,7 +17974,6 @@
         <w:pStyle w:val="Paragrafoelenco"/>
         <w:spacing w:after="120" w:line="240" w:lineRule="auto"/>
         <w:ind w:left="357"/>
-        <w:contextualSpacing w:val="0"/>
         <w:rPr>
           <w:rFonts w:asciiTheme="majorHAnsi" w:hAnsiTheme="majorHAnsi" w:cstheme="majorHAnsi"/>
           <w:noProof/>
@@ -18097,6 +18094,19 @@
         </w:rPr>
         <w:t xml:space="preserve"> </w:t>
       </w:r>
+    </w:p>
+    <w:p>
+      <w:pPr>
+        <w:pStyle w:val="Paragrafoelenco"/>
+        <w:spacing w:after="120" w:line="240" w:lineRule="auto"/>
+        <w:ind w:left="357"/>
+        <w:rPr>
+          <w:rFonts w:asciiTheme="majorHAnsi" w:hAnsiTheme="majorHAnsi" w:cstheme="majorHAnsi"/>
+          <w:noProof/>
+          <w:sz w:val="24"/>
+          <w:szCs w:val="24"/>
+        </w:rPr>
+      </w:pPr>
     </w:p>
     <w:p>
       <w:pPr>
@@ -18346,7 +18356,6 @@
           <w:sz w:val="24"/>
           <w:szCs w:val="24"/>
         </w:rPr>
-        <w:lastRenderedPageBreak/>
         <w:t>Nel caso in cui l’utente modifichi solo l’anno, il soft</w:t>
       </w:r>
       <w:r>
@@ -18825,6 +18834,7 @@
           <w:sz w:val="24"/>
           <w:szCs w:val="24"/>
         </w:rPr>
+        <w:lastRenderedPageBreak/>
         <w:drawing>
           <wp:inline distT="0" distB="0" distL="0" distR="0" wp14:anchorId="5DC6A763" wp14:editId="195C34B4">
             <wp:extent cx="5749925" cy="2985770"/>
@@ -18891,7 +18901,6 @@
           <w:sz w:val="24"/>
           <w:szCs w:val="24"/>
         </w:rPr>
-        <w:lastRenderedPageBreak/>
         <w:t>L'utente potrà valutare quale effetto abbiano le modifiche a determinate variabili sul reddito operativo</w:t>
       </w:r>
       <w:r>
@@ -19379,6 +19388,7 @@
           <w:sz w:val="24"/>
           <w:szCs w:val="24"/>
         </w:rPr>
+        <w:lastRenderedPageBreak/>
         <w:drawing>
           <wp:inline distT="0" distB="0" distL="0" distR="0" wp14:anchorId="6E706522" wp14:editId="472482A8">
             <wp:extent cx="5749925" cy="2978785"/>
@@ -19464,47 +19474,47 @@
           <w:sz w:val="24"/>
           <w:szCs w:val="24"/>
         </w:rPr>
+        <w:t>Di seguito</w:t>
+      </w:r>
+      <w:r>
+        <w:rPr>
+          <w:rFonts w:asciiTheme="majorHAnsi" w:hAnsiTheme="majorHAnsi" w:cstheme="majorHAnsi"/>
+          <w:sz w:val="24"/>
+          <w:szCs w:val="24"/>
+        </w:rPr>
+        <w:t xml:space="preserve"> viene presentato un esempio dei risultati ottenuti, salvati in formato PDF.</w:t>
+      </w:r>
+    </w:p>
+    <w:p>
+      <w:pPr>
+        <w:spacing w:after="120" w:line="240" w:lineRule="auto"/>
+        <w:ind w:left="357"/>
+        <w:rPr>
+          <w:rFonts w:asciiTheme="majorHAnsi" w:hAnsiTheme="majorHAnsi" w:cstheme="majorHAnsi"/>
+          <w:sz w:val="24"/>
+          <w:szCs w:val="24"/>
+        </w:rPr>
+      </w:pPr>
+    </w:p>
+    <w:p>
+      <w:pPr>
+        <w:spacing w:after="120" w:line="240" w:lineRule="auto"/>
+        <w:ind w:left="357"/>
+        <w:rPr>
+          <w:rFonts w:asciiTheme="majorHAnsi" w:hAnsiTheme="majorHAnsi" w:cstheme="majorHAnsi"/>
+          <w:noProof/>
+          <w:sz w:val="24"/>
+          <w:szCs w:val="24"/>
+        </w:rPr>
+      </w:pPr>
+      <w:r>
+        <w:rPr>
+          <w:rFonts w:asciiTheme="majorHAnsi" w:hAnsiTheme="majorHAnsi" w:cstheme="majorHAnsi"/>
+          <w:noProof/>
+          <w:sz w:val="24"/>
+          <w:szCs w:val="24"/>
+        </w:rPr>
         <w:lastRenderedPageBreak/>
-        <w:t>Di seguito</w:t>
-      </w:r>
-      <w:r>
-        <w:rPr>
-          <w:rFonts w:asciiTheme="majorHAnsi" w:hAnsiTheme="majorHAnsi" w:cstheme="majorHAnsi"/>
-          <w:sz w:val="24"/>
-          <w:szCs w:val="24"/>
-        </w:rPr>
-        <w:t xml:space="preserve"> viene presentato un esempio dei risultati ottenuti, salvati in formato PDF.</w:t>
-      </w:r>
-    </w:p>
-    <w:p>
-      <w:pPr>
-        <w:spacing w:after="120" w:line="240" w:lineRule="auto"/>
-        <w:ind w:left="357"/>
-        <w:rPr>
-          <w:rFonts w:asciiTheme="majorHAnsi" w:hAnsiTheme="majorHAnsi" w:cstheme="majorHAnsi"/>
-          <w:sz w:val="24"/>
-          <w:szCs w:val="24"/>
-        </w:rPr>
-      </w:pPr>
-    </w:p>
-    <w:p>
-      <w:pPr>
-        <w:spacing w:after="120" w:line="240" w:lineRule="auto"/>
-        <w:ind w:left="357"/>
-        <w:rPr>
-          <w:rFonts w:asciiTheme="majorHAnsi" w:hAnsiTheme="majorHAnsi" w:cstheme="majorHAnsi"/>
-          <w:noProof/>
-          <w:sz w:val="24"/>
-          <w:szCs w:val="24"/>
-        </w:rPr>
-      </w:pPr>
-      <w:r>
-        <w:rPr>
-          <w:rFonts w:asciiTheme="majorHAnsi" w:hAnsiTheme="majorHAnsi" w:cstheme="majorHAnsi"/>
-          <w:noProof/>
-          <w:sz w:val="24"/>
-          <w:szCs w:val="24"/>
-        </w:rPr>
         <w:drawing>
           <wp:inline distT="0" distB="0" distL="0" distR="0" wp14:anchorId="09432544" wp14:editId="64970E0D">
             <wp:extent cx="5756275" cy="5624830"/>
@@ -24759,6 +24769,7 @@
   <w:style w:type="character" w:default="1" w:styleId="Carpredefinitoparagrafo">
     <w:name w:val="Default Paragraph Font"/>
     <w:uiPriority w:val="1"/>
+    <w:semiHidden/>
     <w:unhideWhenUsed/>
   </w:style>
   <w:style w:type="table" w:default="1" w:styleId="Tabellanormale">

</xml_diff>